<commit_message>
Update site (23.10.2026 15:03:40,89)
</commit_message>
<xml_diff>
--- a/countries/antigua-and-barbuda/output/UPR39_Antigua_and_Barbuda_Thematic_List_of_Recommendations_ASSESSED.docx
+++ b/countries/antigua-and-barbuda/output/UPR39_Antigua_and_Barbuda_Thematic_List_of_Recommendations_ASSESSED.docx
@@ -15828,7 +15828,7 @@
               <w:t xml:space="preserve">Assessment: </w:t>
             </w:r>
             <w:r>
-              <w:t>The documents contain no information on this ask.</w:t>
+              <w:t>The documents contain no information on this recommendation.</w:t>
             </w:r>
           </w:p>
         </w:tc>
@@ -22296,7 +22296,7 @@
               <w:t xml:space="preserve">Assessment: </w:t>
             </w:r>
             <w:r>
-              <w:t>The documents contain no information on this ask.</w:t>
+              <w:t>The documents contain no information on this recommendation.</w:t>
             </w:r>
           </w:p>
         </w:tc>
@@ -22500,7 +22500,7 @@
               <w:t xml:space="preserve">Assessment: </w:t>
             </w:r>
             <w:r>
-              <w:t>A GBV Action Plan (2023), the SARC and a gender policy in final draft advance this ask.</w:t>
+              <w:t>A GBV Action Plan (2023), the SARC and a gender policy in final draft advance this recommendation.</w:t>
             </w:r>
             <w:r>
               <w:rPr>
@@ -22807,7 +22807,7 @@
               <w:t xml:space="preserve">Assessment: </w:t>
             </w:r>
             <w:r>
-              <w:t>A GBV Action Plan (2023), the SARC and a gender policy in final draft advance this ask.</w:t>
+              <w:t>A GBV Action Plan (2023), the SARC and a gender policy in final draft advance this recommendation.</w:t>
             </w:r>
             <w:r>
               <w:rPr>
@@ -24659,7 +24659,7 @@
               <w:t xml:space="preserve">Assessment: </w:t>
             </w:r>
             <w:r>
-              <w:t>The documents contain no information on this ask.</w:t>
+              <w:t>The documents contain no information on this recommendation.</w:t>
             </w:r>
           </w:p>
         </w:tc>
@@ -26815,7 +26815,7 @@
               <w:t xml:space="preserve">Assessment: </w:t>
             </w:r>
             <w:r>
-              <w:t>The documents contain no information on this ask.</w:t>
+              <w:t>The documents contain no information on this recommendation.</w:t>
             </w:r>
           </w:p>
         </w:tc>
@@ -29997,7 +29997,7 @@
               <w:t xml:space="preserve">Assessment: </w:t>
             </w:r>
             <w:r>
-              <w:t>The documents contain no information on this ask.</w:t>
+              <w:t>The documents contain no information on this recommendation.</w:t>
             </w:r>
           </w:p>
         </w:tc>
@@ -30458,7 +30458,7 @@
               <w:t xml:space="preserve">Assessment: </w:t>
             </w:r>
             <w:r>
-              <w:t>The documents contain no information on this ask.</w:t>
+              <w:t>The documents contain no information on this recommendation.</w:t>
             </w:r>
           </w:p>
         </w:tc>
@@ -31279,7 +31279,7 @@
               <w:t xml:space="preserve">Assessment: </w:t>
             </w:r>
             <w:r>
-              <w:t>The documents contain no information on this ask.</w:t>
+              <w:t>The documents contain no information on this recommendation.</w:t>
             </w:r>
           </w:p>
         </w:tc>
@@ -33542,7 +33542,7 @@
               <w:t xml:space="preserve">Assessment: </w:t>
             </w:r>
             <w:r>
-              <w:t>The documents contain no information on this ask.</w:t>
+              <w:t>The documents contain no information on this recommendation.</w:t>
             </w:r>
           </w:p>
         </w:tc>
@@ -34346,7 +34346,7 @@
               <w:t xml:space="preserve">Assessment: </w:t>
             </w:r>
             <w:r>
-              <w:t>The documents contain no information on this ask.</w:t>
+              <w:t>The documents contain no information on this recommendation.</w:t>
             </w:r>
           </w:p>
         </w:tc>
@@ -35120,7 +35120,7 @@
               <w:t xml:space="preserve">Assessment: </w:t>
             </w:r>
             <w:r>
-              <w:t>The documents contain no information on this ask.</w:t>
+              <w:t>The documents contain no information on this recommendation.</w:t>
             </w:r>
           </w:p>
         </w:tc>
@@ -38136,7 +38136,7 @@
               <w:t xml:space="preserve">Assessment: </w:t>
             </w:r>
             <w:r>
-              <w:t>The documents contain no information on this ask.</w:t>
+              <w:t>The documents contain no information on this recommendation.</w:t>
             </w:r>
           </w:p>
         </w:tc>
@@ -38699,7 +38699,7 @@
               <w:t xml:space="preserve">Assessment: </w:t>
             </w:r>
             <w:r>
-              <w:t>A GBV Action Plan (2023), the SARC and a Cabinet-approved shelter partnership advance the policy ask; no temporary special measures are reported.</w:t>
+              <w:t>A GBV Action Plan (2023), the SARC and a Cabinet-approved shelter partnership advance the policy recommendation; no temporary special measures are reported.</w:t>
             </w:r>
             <w:r>
               <w:rPr>
@@ -38991,7 +38991,7 @@
               <w:t xml:space="preserve">Assessment: </w:t>
             </w:r>
             <w:r>
-              <w:t>The documents contain no information on this ask.</w:t>
+              <w:t>The documents contain no information on this recommendation.</w:t>
             </w:r>
           </w:p>
         </w:tc>

</xml_diff>